<commit_message>
small update for document & PMC View UI
</commit_message>
<xml_diff>
--- a/frontend/public/qpmc_template.docx
+++ b/frontend/public/qpmc_template.docx
@@ -739,8 +739,8 @@
         <w:gridCol w:w="810"/>
         <w:gridCol w:w="725"/>
         <w:gridCol w:w="720"/>
-        <w:gridCol w:w="810"/>
-        <w:gridCol w:w="1356"/>
+        <w:gridCol w:w="900"/>
+        <w:gridCol w:w="1266"/>
         <w:gridCol w:w="2787"/>
       </w:tblGrid>
       <w:tr>
@@ -778,7 +778,7 @@
         </w:tc>
         <w:tc>
           <w:tcPr>
-            <w:tcW w:w="3065" w:type="dxa"/>
+            <w:tcW w:w="3155" w:type="dxa"/>
             <w:gridSpan w:val="4"/>
             <w:shd w:val="clear" w:color="auto" w:fill="E7E6E6"/>
             <w:vAlign w:val="center"/>
@@ -807,7 +807,7 @@
         </w:tc>
         <w:tc>
           <w:tcPr>
-            <w:tcW w:w="1356" w:type="dxa"/>
+            <w:tcW w:w="1266" w:type="dxa"/>
             <w:vMerge w:val="restart"/>
             <w:shd w:val="clear" w:color="auto" w:fill="E7E6E6"/>
             <w:vAlign w:val="center"/>
@@ -879,6 +879,7 @@
             <w:pPr>
               <w:widowControl w:val="0"/>
               <w:spacing w:after="0"/>
+              <w:jc w:val="center"/>
               <w:rPr>
                 <w:rFonts w:ascii="Cambria" w:eastAsia="Cambria" w:hAnsi="Cambria" w:cs="Cambria"/>
                 <w:b/>
@@ -918,6 +919,7 @@
           <w:tcPr>
             <w:tcW w:w="725" w:type="dxa"/>
             <w:shd w:val="clear" w:color="auto" w:fill="E7E6E6"/>
+            <w:vAlign w:val="center"/>
           </w:tcPr>
           <w:p>
             <w:pPr>
@@ -943,6 +945,7 @@
           <w:tcPr>
             <w:tcW w:w="720" w:type="dxa"/>
             <w:shd w:val="clear" w:color="auto" w:fill="E7E6E6"/>
+            <w:vAlign w:val="center"/>
           </w:tcPr>
           <w:p>
             <w:pPr>
@@ -966,8 +969,9 @@
         </w:tc>
         <w:tc>
           <w:tcPr>
-            <w:tcW w:w="810" w:type="dxa"/>
+            <w:tcW w:w="900" w:type="dxa"/>
             <w:shd w:val="clear" w:color="auto" w:fill="E7E6E6"/>
+            <w:vAlign w:val="center"/>
           </w:tcPr>
           <w:p>
             <w:pPr>
@@ -991,7 +995,7 @@
         </w:tc>
         <w:tc>
           <w:tcPr>
-            <w:tcW w:w="1356" w:type="dxa"/>
+            <w:tcW w:w="1266" w:type="dxa"/>
             <w:vMerge/>
             <w:shd w:val="clear" w:color="auto" w:fill="E7E6E6"/>
             <w:vAlign w:val="center"/>
@@ -1000,6 +1004,7 @@
             <w:pPr>
               <w:widowControl w:val="0"/>
               <w:spacing w:after="0"/>
+              <w:jc w:val="center"/>
               <w:rPr>
                 <w:rFonts w:ascii="Cambria" w:eastAsia="Cambria" w:hAnsi="Cambria" w:cs="Cambria"/>
                 <w:sz w:val="12"/>
@@ -1019,6 +1024,7 @@
             <w:pPr>
               <w:widowControl w:val="0"/>
               <w:spacing w:after="0"/>
+              <w:jc w:val="center"/>
               <w:rPr>
                 <w:rFonts w:ascii="Cambria" w:eastAsia="Cambria" w:hAnsi="Cambria" w:cs="Cambria"/>
                 <w:sz w:val="12"/>
@@ -1112,6 +1118,7 @@
           <w:p>
             <w:pPr>
               <w:spacing w:after="0" w:line="240" w:lineRule="auto"/>
+              <w:jc w:val="center"/>
               <w:rPr>
                 <w:rFonts w:ascii="Cambria" w:eastAsia="Cambria" w:hAnsi="Cambria" w:cs="Cambria"/>
                 <w:b/>
@@ -1180,7 +1187,7 @@
         </w:tc>
         <w:tc>
           <w:tcPr>
-            <w:tcW w:w="810" w:type="dxa"/>
+            <w:tcW w:w="900" w:type="dxa"/>
             <w:vAlign w:val="center"/>
           </w:tcPr>
           <w:p>
@@ -1227,7 +1234,7 @@
         </w:tc>
         <w:tc>
           <w:tcPr>
-            <w:tcW w:w="1356" w:type="dxa"/>
+            <w:tcW w:w="1266" w:type="dxa"/>
             <w:vAlign w:val="center"/>
           </w:tcPr>
           <w:p>
@@ -3281,6 +3288,12 @@
 </file>
 
 <file path=customXml/item1.xml><?xml version="1.0" encoding="utf-8"?>
+<go:gDocsCustomXmlDataStorage xmlns:go="http://customooxmlschemas.google.com/" xmlns:r="http://schemas.openxmlformats.org/officeDocument/2006/relationships" uri="GoogleDocsCustomDataVersion2">
+  <go:docsCustomData xmlns:go="http://customooxmlschemas.google.com/" roundtripDataSignature="AMtx7mh6zYF3essPI6bh0gy6HaqC59eb5g==">CgMxLjA4AHIhMS1HOWYzU1ZqS0pQcHYyR1Z5bmdVRk5BSGNTRXMwX3cx</go:docsCustomData>
+</go:gDocsCustomXmlDataStorage>
+</file>
+
+<file path=customXml/item2.xml><?xml version="1.0" encoding="utf-8"?>
 <s:customData xmlns="http://www.wps.cn/officeDocument/2013/wpsCustomData" xmlns:s="http://www.wps.cn/officeDocument/2013/wpsCustomData">
   <customSectProps/>
   <customShpExts>
@@ -3289,25 +3302,19 @@
 </s:customData>
 </file>
 
-<file path=customXml/item2.xml><?xml version="1.0" encoding="utf-8"?>
-<go:gDocsCustomXmlDataStorage xmlns:go="http://customooxmlschemas.google.com/" xmlns:r="http://schemas.openxmlformats.org/officeDocument/2006/relationships" uri="GoogleDocsCustomDataVersion2">
-  <go:docsCustomData xmlns:go="http://customooxmlschemas.google.com/" roundtripDataSignature="AMtx7mh6zYF3essPI6bh0gy6HaqC59eb5g==">CgMxLjA4AHIhMS1HOWYzU1ZqS0pQcHYyR1Z5bmdVRk5BSGNTRXMwX3cx</go:docsCustomData>
-</go:gDocsCustomXmlDataStorage>
-</file>
-
 <file path=customXml/itemProps1.xml><?xml version="1.0" encoding="utf-8"?>
-<ds:datastoreItem xmlns:ds="http://schemas.openxmlformats.org/officeDocument/2006/customXml" ds:itemID="{B1977F7D-205B-4081-913C-38D41E755F92}">
-  <ds:schemaRefs>
-    <ds:schemaRef ds:uri="http://www.wps.cn/officeDocument/2013/wpsCustomData"/>
-  </ds:schemaRefs>
-</ds:datastoreItem>
-</file>
-
-<file path=customXml/itemProps2.xml><?xml version="1.0" encoding="utf-8"?>
 <ds:datastoreItem xmlns:ds="http://schemas.openxmlformats.org/officeDocument/2006/customXml" ds:itemID="{11111111-1234-1234-1234-123412341234}">
   <ds:schemaRefs>
     <ds:schemaRef ds:uri="http://customooxmlschemas.google.com/"/>
     <ds:schemaRef ds:uri="http://schemas.openxmlformats.org/officeDocument/2006/relationships"/>
   </ds:schemaRefs>
 </ds:datastoreItem>
+</file>
+
+<file path=customXml/itemProps2.xml><?xml version="1.0" encoding="utf-8"?>
+<ds:datastoreItem xmlns:ds="http://schemas.openxmlformats.org/officeDocument/2006/customXml" ds:itemID="{B1977F7D-205B-4081-913C-38D41E755F92}">
+  <ds:schemaRefs>
+    <ds:schemaRef ds:uri="http://www.wps.cn/officeDocument/2013/wpsCustomData"/>
+  </ds:schemaRefs>
+</ds:datastoreItem>
 </file>
</xml_diff>